<commit_message>
Remove link do Canva e move paginação para o rodapé
Co-Authored-By: Claude Fable 5 <noreply@anthropic.com>
Claude-Session: https://claude.ai/code/session_01Qm5TbKT6Wz1EseSW3BRqGo
</commit_message>
<xml_diff>
--- a/Text/papermalleuscajada_ABNT_10p.docx
+++ b/Text/papermalleuscajada_ABNT_10p.docx
@@ -131,7 +131,7 @@
         <w:rPr>
           <w:sz w:val="20"/>
         </w:rPr>
-        <w:t>* Doutoranda no Programa de Pós-Graduação em Direito da Universidade Federal de Santa Catarina (PPGD/UFSC). Short paper apresentado na disciplina DIR410346, História do Direito Penal e da Justiça Criminal (2026.1). Apresentação: https://canva.link/comoseinventaumabruxa.</w:t>
+        <w:t>* Doutoranda no Programa de Pós-Graduação em Direito da Universidade Federal de Santa Catarina (PPGD/UFSC). Short paper apresentado na disciplina DIR410346, História do Direito Penal e da Justiça Criminal (2026.1).</w:t>
       </w:r>
     </w:p>
     <w:p>
@@ -1274,7 +1274,7 @@
       </w:r>
     </w:p>
     <w:sectPr>
-      <w:headerReference w:type="default" r:id="rId9"/>
+      <w:footerReference w:type="default" r:id="rId9"/>
       <w:pgSz w:w="11906" w:h="16838"/>
       <w:pgMar w:top="1701" w:right="1134" w:bottom="1134" w:left="1701" w:header="720" w:footer="720" w:gutter="0"/>
       <w:cols w:space="720"/>
@@ -1284,11 +1284,11 @@
 </w:document>
 </file>
 
-<file path=word/header1.xml><?xml version="1.0" encoding="utf-8"?>
-<w:hdr xmlns:m="http://schemas.openxmlformats.org/officeDocument/2006/math" xmlns:mc="http://schemas.openxmlformats.org/markup-compatibility/2006" xmlns:mo="http://schemas.microsoft.com/office/mac/office/2008/main" xmlns:mv="urn:schemas-microsoft-com:mac:vml" xmlns:o="urn:schemas-microsoft-com:office:office" xmlns:r="http://schemas.openxmlformats.org/officeDocument/2006/relationships" xmlns:v="urn:schemas-microsoft-com:vml" xmlns:w10="urn:schemas-microsoft-com:office:word" xmlns:w14="http://schemas.microsoft.com/office/word/2010/wordml" xmlns:w="http://schemas.openxmlformats.org/wordprocessingml/2006/main" xmlns:wne="http://schemas.microsoft.com/office/word/2006/wordml" xmlns:wp14="http://schemas.microsoft.com/office/word/2010/wordprocessingDrawing" xmlns:wp="http://schemas.openxmlformats.org/drawingml/2006/wordprocessingDrawing" xmlns:wpc="http://schemas.microsoft.com/office/word/2010/wordprocessingCanvas" xmlns:wpg="http://schemas.microsoft.com/office/word/2010/wordprocessingGroup" xmlns:wpi="http://schemas.microsoft.com/office/word/2010/wordprocessingInk" xmlns:wps="http://schemas.microsoft.com/office/word/2010/wordprocessingShape" mc:Ignorable="w14 wp14">
+<file path=word/footer1.xml><?xml version="1.0" encoding="utf-8"?>
+<w:ftr xmlns:m="http://schemas.openxmlformats.org/officeDocument/2006/math" xmlns:mc="http://schemas.openxmlformats.org/markup-compatibility/2006" xmlns:mo="http://schemas.microsoft.com/office/mac/office/2008/main" xmlns:mv="urn:schemas-microsoft-com:mac:vml" xmlns:o="urn:schemas-microsoft-com:office:office" xmlns:r="http://schemas.openxmlformats.org/officeDocument/2006/relationships" xmlns:v="urn:schemas-microsoft-com:vml" xmlns:w10="urn:schemas-microsoft-com:office:word" xmlns:w14="http://schemas.microsoft.com/office/word/2010/wordml" xmlns:w="http://schemas.openxmlformats.org/wordprocessingml/2006/main" xmlns:wne="http://schemas.microsoft.com/office/word/2006/wordml" xmlns:wp14="http://schemas.microsoft.com/office/word/2010/wordprocessingDrawing" xmlns:wp="http://schemas.openxmlformats.org/drawingml/2006/wordprocessingDrawing" xmlns:wpc="http://schemas.microsoft.com/office/word/2010/wordprocessingCanvas" xmlns:wpg="http://schemas.microsoft.com/office/word/2010/wordprocessingGroup" xmlns:wpi="http://schemas.microsoft.com/office/word/2010/wordprocessingInk" xmlns:wps="http://schemas.microsoft.com/office/word/2010/wordprocessingShape" mc:Ignorable="w14 wp14">
   <w:p>
     <w:pPr>
-      <w:pStyle w:val="Header"/>
+      <w:pStyle w:val="Footer"/>
       <w:jc w:val="right"/>
     </w:pPr>
     <w:r>
@@ -1299,7 +1299,7 @@
     </w:r>
     <w:fldSimple w:instr="PAGE"/>
   </w:p>
-</w:hdr>
+</w:ftr>
 </file>
 
 <file path=word/numbering.xml><?xml version="1.0" encoding="utf-8"?>

</xml_diff>

<commit_message>
Adiciona bloco metodológico na introdução (objeto, hipótese, fontes, método)
Co-Authored-By: Claude Fable 5 <noreply@anthropic.com>
Claude-Session: https://claude.ai/code/session_01Qm5TbKT6Wz1EseSW3BRqGo
</commit_message>
<xml_diff>
--- a/Text/papermalleuscajada_ABNT_10p.docx
+++ b/Text/papermalleuscajada_ABNT_10p.docx
@@ -249,6 +249,40 @@
           <w:i w:val="0"/>
         </w:rPr>
         <w:t>, a bruxa é uma construção compósita. Na Bahia, essa construção não desaparece, mas se desfaz parcialmente: alguns elementos permanecem, outros faltam, e outros ainda emergem do contexto colonial. Ao final, o tribunal registra dúvida sobre a substância das acusações, ao anotar que “Parece que tudo são embustes e enganos as culpas desta ré” (ANTT, processo nº 10748), e mesmo assim pune. Essa contradição não é detalhe; ela é o núcleo historiográfico do problema.</w:t>
+      </w:r>
+    </w:p>
+    <w:p>
+      <w:pPr>
+        <w:ind w:firstLine="709"/>
+      </w:pPr>
+      <w:r>
+        <w:rPr>
+          <w:i w:val="0"/>
+        </w:rPr>
+        <w:t xml:space="preserve">Convém explicitar, desde já, os contornos metodológicos do trabalho. O tema geral é a historicidade das categorias jurídico-penais, isto é, o modo como o direito penal fabrica, estabiliza e transforma os nomes com que criminaliza. O objeto específico é a bruxaria como tipo compósito, observada em dois pontos de um circuito: a sistematização doutrinária do </w:t>
+      </w:r>
+      <w:r>
+        <w:rPr>
+          <w:i/>
+        </w:rPr>
+        <w:t>Malleus Maleficarum</w:t>
+      </w:r>
+      <w:r>
+        <w:rPr>
+          <w:i w:val="0"/>
+        </w:rPr>
+        <w:t xml:space="preserve"> (1487) e sua deformação na Primeira Visitação do Santo Ofício à Bahia (1591-1593). O problema pode ser enunciado numa pergunta dupla: como uma figura social e teologicamente suspeita se converte em categoria penal processável, e o que acontece com essa categoria quando circula para o espaço colonial? A hipótese sustentada é a de que a bruxaria não constitui tipo penal estável: é categoria compósita, montada doutrinariamente e parcialmente desmontada na tradução colonial, e o caso Cajada torna essa instabilidade visível porque o tribunal pune mesmo registrando dúvida.</w:t>
+      </w:r>
+    </w:p>
+    <w:p>
+      <w:pPr>
+        <w:ind w:firstLine="709"/>
+      </w:pPr>
+      <w:r>
+        <w:rPr>
+          <w:i w:val="0"/>
+        </w:rPr>
+        <w:t>Quanto às fontes e ao método, o trabalho apoia-se no processo nº 10748 da Inquisição de Lisboa e no livro de Denunciações da Bahia (ANTT, liv. 784) como fontes primárias, lidos por meio das edições documentais de Capistrano de Abreu (1925; 1935) e Vainfas (1997) e do estudo de Araújo (2016). O método é o estudo de caso qualitativo com contraexemplos (Scheuberin, Guiomar, Catarina), articulado a dois campos historiográficos: a história da justiça criminal, com Sbriccoli (2011), Meccarelli (2018) e Hespanha (1994), e a historiografia da bruxaria e da feitiçaria colonial, com Broedel (2003) e Souza (1986).</w:t>
       </w:r>
     </w:p>
     <w:p>

</xml_diff>